<commit_message>
Business- en enterprise-architectuur fase 2: interactieve leesversie + toolbijlage
Reader/werkboek/docentenhandleiding/slidedeck per deel krijgen een interactieve
HTML-leesversie (tabs, downloadbox, vorige/volgende-navigatie) naast de bestaande
.docx/.pptx-downloads; index.html linkt nu naar reader.html per deel en bevat de
nieuwe Toolbijlage-sectie (Archi-referentiemateriaal).

Tijdens visuele QA (Word/PowerPoint-COM-render naar PDF/PNG) kwamen twee generieke
bugs in de bronconversie boven: "## "-kopregels (werkboek-secties en de
"Dagdeel A/B"-scheiders in delen 15/19/30) werden niet als kop herkend en de
"## Dagdeel"-scheiders lekten als losse tekst een naastgelegen pptx-slide in; een
ontbrekende bijschrift-dubbele punt in deel 23's [FIGUUR 23-1]-marker liet de
bijbehorende afbeelding in reader/slidedeck stilletjes wegvallen. Alle 30 delen
zijn na de fixes in convert-pptx.js opnieuw gegenereerd.

Co-Authored-By: Claude Sonnet 5 <noreply@anthropic.com>
</commit_message>
<xml_diff>
--- a/enterprise-architectuur/niveau-1/deel-01/werkboek.docx
+++ b/enterprise-architectuur/niveau-1/deel-01/werkboek.docx
@@ -1053,22 +1053,28 @@
       </w:r>
     </w:p>
     <w:p>
-      <w:pPr>
-        <w:spacing w:after="160" w:line="300"/>
-        <w:jc w:val="left"/>
-      </w:pPr>
-      <w:r>
-        <w:rPr>
-          <w:rFonts w:ascii="Calibri" w:cs="Calibri" w:eastAsia="Calibri" w:hAnsi="Calibri"/>
-          <w:b w:val="false"/>
-          <w:bCs w:val="false"/>
-          <w:i w:val="false"/>
-          <w:iCs w:val="false"/>
-          <w:color w:val="1A1A1A"/>
-          <w:sz w:val="21"/>
-          <w:szCs w:val="21"/>
-        </w:rPr>
-        <w:t xml:space="preserve">## Bijlage A — Uittreksel post-mortem WGP 2.0</w:t>
+      <w:r>
+        <w:br w:type="page"/>
+      </w:r>
+    </w:p>
+    <w:p>
+      <w:pPr>
+        <w:pStyle w:val="Heading2"/>
+        <w:pBdr>
+          <w:bottom w:val="single" w:color="2563A8" w:sz="6" w:space="4"/>
+        </w:pBdr>
+        <w:spacing w:after="160" w:before="300"/>
+      </w:pPr>
+      <w:r>
+        <w:rPr>
+          <w:rFonts w:ascii="Calibri" w:cs="Calibri" w:eastAsia="Calibri" w:hAnsi="Calibri"/>
+          <w:b/>
+          <w:bCs/>
+          <w:color w:val="2563A8"/>
+          <w:sz w:val="24"/>
+          <w:szCs w:val="24"/>
+        </w:rPr>
+        <w:t xml:space="preserve">Bijlage A — Uittreksel post-mortem WGP 2.0</w:t>
       </w:r>
     </w:p>
     <w:p>
@@ -1340,22 +1346,28 @@
       </w:r>
     </w:p>
     <w:p>
-      <w:pPr>
-        <w:spacing w:after="160" w:line="300"/>
-        <w:jc w:val="left"/>
-      </w:pPr>
-      <w:r>
-        <w:rPr>
-          <w:rFonts w:ascii="Calibri" w:cs="Calibri" w:eastAsia="Calibri" w:hAnsi="Calibri"/>
-          <w:b w:val="false"/>
-          <w:bCs w:val="false"/>
-          <w:i w:val="false"/>
-          <w:iCs w:val="false"/>
-          <w:color w:val="1A1A1A"/>
-          <w:sz w:val="21"/>
-          <w:szCs w:val="21"/>
-        </w:rPr>
-        <w:t xml:space="preserve">## Modeluitwerkingen</w:t>
+      <w:r>
+        <w:br w:type="page"/>
+      </w:r>
+    </w:p>
+    <w:p>
+      <w:pPr>
+        <w:pStyle w:val="Heading2"/>
+        <w:pBdr>
+          <w:bottom w:val="single" w:color="2563A8" w:sz="6" w:space="4"/>
+        </w:pBdr>
+        <w:spacing w:after="160" w:before="300"/>
+      </w:pPr>
+      <w:r>
+        <w:rPr>
+          <w:rFonts w:ascii="Calibri" w:cs="Calibri" w:eastAsia="Calibri" w:hAnsi="Calibri"/>
+          <w:b/>
+          <w:bCs/>
+          <w:color w:val="2563A8"/>
+          <w:sz w:val="24"/>
+          <w:szCs w:val="24"/>
+        </w:rPr>
+        <w:t xml:space="preserve">Modeluitwerkingen</w:t>
       </w:r>
     </w:p>
     <w:p>

</xml_diff>